<commit_message>
chore: update and populate node_modules dependencies
</commit_message>
<xml_diff>
--- a/WebApi/WebApi/wwwroot/documents/demo.docx
+++ b/WebApi/WebApi/wwwroot/documents/demo.docx
@@ -41,6 +41,11 @@
           <w:lang w:val="en-US"/>
         </w:rPr>
       </w:r>
+      <w:r>
+        <w:rPr>
+          <w:lang w:val="en-US"/>
+        </w:rPr>
+      </w:r>
     </w:p>
     <w:p>
       <w:pPr>
@@ -69,6 +74,11 @@
     </w:p>
     <w:p>
       <w:pPr>
+        <w:pStyle w:val="912"/>
+        <w:numPr>
+          <w:ilvl w:val="0"/>
+          <w:numId w:val="10"/>
+        </w:numPr>
         <w:pBdr/>
         <w:spacing/>
         <w:ind/>
@@ -80,7 +90,7 @@
         <w:rPr>
           <w:lang w:val="en-US"/>
         </w:rPr>
-        <w:t xml:space="preserve">TEST TEST TEST</w:t>
+        <w:t xml:space="preserve">TEST, 2.TEST</w:t>
       </w:r>
       <w:r>
         <w:rPr>
@@ -1385,6 +1395,135 @@
       <w:rPr>
         <w:rFonts w:cs="Times New Roman"/>
       </w:rPr>
+      <w:start w:val="1"/>
+      <w:suff w:val="tab"/>
+    </w:lvl>
+  </w:abstractNum>
+  <w:abstractNum w:abstractNumId="9">
+    <w:nsid w:val="68AB547D"/>
+    <w:lvl w:ilvl="0">
+      <w:isLgl w:val="false"/>
+      <w:lvlJc w:val="left"/>
+      <w:lvlText w:val="%1."/>
+      <w:numFmt w:val="decimal"/>
+      <w:pPr>
+        <w:pBdr/>
+        <w:spacing/>
+        <w:ind w:hanging="360" w:left="709"/>
+      </w:pPr>
+      <w:rPr/>
+      <w:start w:val="1"/>
+      <w:suff w:val="tab"/>
+    </w:lvl>
+    <w:lvl w:ilvl="1">
+      <w:isLgl w:val="false"/>
+      <w:lvlJc w:val="left"/>
+      <w:lvlText w:val="%2."/>
+      <w:numFmt w:val="lowerLetter"/>
+      <w:pPr>
+        <w:pBdr/>
+        <w:spacing/>
+        <w:ind w:hanging="360" w:left="1429"/>
+      </w:pPr>
+      <w:rPr/>
+      <w:start w:val="1"/>
+      <w:suff w:val="tab"/>
+    </w:lvl>
+    <w:lvl w:ilvl="2">
+      <w:isLgl w:val="false"/>
+      <w:lvlJc w:val="right"/>
+      <w:lvlText w:val="%3."/>
+      <w:numFmt w:val="lowerRoman"/>
+      <w:pPr>
+        <w:pBdr/>
+        <w:spacing/>
+        <w:ind w:hanging="180" w:left="2149"/>
+      </w:pPr>
+      <w:rPr/>
+      <w:start w:val="1"/>
+      <w:suff w:val="tab"/>
+    </w:lvl>
+    <w:lvl w:ilvl="3">
+      <w:isLgl w:val="false"/>
+      <w:lvlJc w:val="left"/>
+      <w:lvlText w:val="%4."/>
+      <w:numFmt w:val="decimal"/>
+      <w:pPr>
+        <w:pBdr/>
+        <w:spacing/>
+        <w:ind w:hanging="360" w:left="2869"/>
+      </w:pPr>
+      <w:rPr/>
+      <w:start w:val="1"/>
+      <w:suff w:val="tab"/>
+    </w:lvl>
+    <w:lvl w:ilvl="4">
+      <w:isLgl w:val="false"/>
+      <w:lvlJc w:val="left"/>
+      <w:lvlText w:val="%5."/>
+      <w:numFmt w:val="lowerLetter"/>
+      <w:pPr>
+        <w:pBdr/>
+        <w:spacing/>
+        <w:ind w:hanging="360" w:left="3589"/>
+      </w:pPr>
+      <w:rPr/>
+      <w:start w:val="1"/>
+      <w:suff w:val="tab"/>
+    </w:lvl>
+    <w:lvl w:ilvl="5">
+      <w:isLgl w:val="false"/>
+      <w:lvlJc w:val="right"/>
+      <w:lvlText w:val="%6."/>
+      <w:numFmt w:val="lowerRoman"/>
+      <w:pPr>
+        <w:pBdr/>
+        <w:spacing/>
+        <w:ind w:hanging="180" w:left="4309"/>
+      </w:pPr>
+      <w:rPr/>
+      <w:start w:val="1"/>
+      <w:suff w:val="tab"/>
+    </w:lvl>
+    <w:lvl w:ilvl="6">
+      <w:isLgl w:val="false"/>
+      <w:lvlJc w:val="left"/>
+      <w:lvlText w:val="%7."/>
+      <w:numFmt w:val="decimal"/>
+      <w:pPr>
+        <w:pBdr/>
+        <w:spacing/>
+        <w:ind w:hanging="360" w:left="5029"/>
+      </w:pPr>
+      <w:rPr/>
+      <w:start w:val="1"/>
+      <w:suff w:val="tab"/>
+    </w:lvl>
+    <w:lvl w:ilvl="7">
+      <w:isLgl w:val="false"/>
+      <w:lvlJc w:val="left"/>
+      <w:lvlText w:val="%8."/>
+      <w:numFmt w:val="lowerLetter"/>
+      <w:pPr>
+        <w:pBdr/>
+        <w:spacing/>
+        <w:ind w:hanging="360" w:left="5749"/>
+      </w:pPr>
+      <w:rPr/>
+      <w:start w:val="1"/>
+      <w:suff w:val="tab"/>
+    </w:lvl>
+    <w:lvl w:ilvl="8">
+      <w:isLgl w:val="false"/>
+      <w:lvlJc w:val="right"/>
+      <w:lvlText w:val="%9."/>
+      <w:numFmt w:val="lowerRoman"/>
+      <w:pPr>
+        <w:pBdr/>
+        <w:spacing/>
+        <w:ind w:hanging="180" w:left="6469"/>
+      </w:pPr>
+      <w:rPr/>
       <w:start w:val="1"/>
       <w:suff w:val="tab"/>
     </w:lvl>
@@ -1442,6 +1581,9 @@
   </w:num>
   <w:num w:numId="9">
     <w:abstractNumId w:val="2"/>
+  </w:num>
+  <w:num w:numId="10">
+    <w:abstractNumId w:val="9"/>
   </w:num>
 </w:numbering>
 </file>

</xml_diff>